<commit_message>
fix(cd2): resolve 6 orphan refs by citing them; corpus citation-integrity certification
CĐ2: cited the 6 previously-uncited references at accurate locations (resolving
them as orphans): Bharadwaj et al. (2013) on digital business strategy; Bhandari
et al. (2023) on recent RBV; Chen & Tan (2012) + Xiao et al. (2013) on Chinese
firms' I–P; Melitz (2003) on exporter productivity selection; Nielsen & Nielsen
(2011) on TMT international orientation (Upper Echelons). Each placed where its
topic already appears — no forced or inaccurate citations.

Added reviews/CITATION_INTEGRITY_CERTIFICATION_2026-06-15.md: corpus-wide two-way
check now clean (thesis Ch.1–5, CĐ1, CĐ2, P3–P11) — zero broken cites, zero
orphans, except two flagged real-but-untitled works (CIEM 2023; Kim, Kumar,
Ramalho & Russell 2026) the author must supply, and DOIs for Caves/Vernon left
for verify_dois. CĐ2 docx + LaTeX rebuilt.
</commit_message>
<xml_diff>
--- a/dist/chuyen_de_2/00_cd2_ctu_final_vi.docx
+++ b/dist/chuyen_de_2/00_cd2_ctu_final_vi.docx
@@ -1645,7 +1645,7 @@
         <w:pStyle w:val="BodyText"/>
       </w:pPr>
       <w:r>
-        <w:t xml:space="preserve">Đồng thời, châu Á đang trải qua chuyển đổi số chưa từng có trong giai đoạn 2018–2025. Sự bùng nổ của hạ tầng số và trí tuệ nhân tạo từ năm 2023 đã tái định hình cơ chế qua đó năng lực số tác động lên quốc tế hóa và hiệu quả (Banalieva &amp; Dhanaraj, 2019; Verhoef et al., 2021; Yang, Zhao &amp; Wei, 2025).</w:t>
+        <w:t xml:space="preserve">Đồng thời, châu Á đang trải qua chuyển đổi số chưa từng có trong giai đoạn 2018–2025. Sự bùng nổ của hạ tầng số và trí tuệ nhân tạo từ năm 2023 đã tái định hình cơ chế qua đó năng lực số tác động lên quốc tế hóa và hiệu quả (Bharadwaj et al., 2013; Banalieva &amp; Dhanaraj, 2019; Verhoef et al., 2021; Yang, Zhao &amp; Wei, 2025).</w:t>
       </w:r>
     </w:p>
     <w:p>
@@ -1669,7 +1669,7 @@
         <w:pStyle w:val="BodyText"/>
       </w:pPr>
       <w:r>
-        <w:t xml:space="preserve">Bốn bản thảo thực nghiệm đồng hành cung cấp bằng chứng quốc gia cụ thể kiểm định khả năng của khung đề xuất. P2 Trung Quốc SMEs (Đỗ &amp; Phan, 2026, JFAR đã công bố) phân tích 2.700 doanh nghiệp SMEs Trung Quốc và tìm thấy dạng bậc ba (cubic nonlinearity / S-curve ba giai đoạn), cung cấp tiền thân thực nghiệm cho H1 và cơ sở để so sánh với P5. P3 Việt Nam (Đỗ &amp; Phan, 2026, JABS đang phản biện) phân tích 2.958 doanh nghiệp WBES ba sóng (2009, 2015, 2023) xác nhận chữ U ngược trong cả ba sóng với điểm uốn 46,2% (2009), 39,3% (2015), 41,6% (2023), 39,7% (tổng hợp); TCI nhân quả qua biến công cụ (β = 1,639, F bậc một = 22,1); DAI theo giai đoạn và phụ thuộc chọn lựa (IV null, β = 0,018). P4 Singapore (Mar, Đỗ &amp; Phan, 2026, MIR đang phản biện) phân tích 623 doanh nghiệp WBES 2023, cho thấy điểm uốn hàm ý ở FSTS khoảng 88,6% và DAI hoạt động như nguồn lực mở rộng tình huống với hệ số DAI×FSTS² = +3,119 (p = 0,005). P5 Trung Quốc (Đỗ &amp; Phan, 2026, IJOEM đang phản biện) phân tích 4.559 doanh nghiệp WBES hai sóng (2012, 2024) xác nhận chữ U ngược bền vững cấu trúc với điểm uốn 49,4% (2012) và 47,2% (2024).</w:t>
+        <w:t xml:space="preserve">Bốn bản thảo thực nghiệm đồng hành cung cấp bằng chứng quốc gia cụ thể kiểm định khả năng của khung đề xuất. P2 Trung Quốc SMEs (Đỗ &amp; Phan, 2026, JFAR đã công bố) phân tích 2.700 doanh nghiệp SMEs Trung Quốc và tìm thấy dạng bậc ba (cubic nonlinearity / S-curve ba giai đoạn), cung cấp tiền thân thực nghiệm cho H1 và cơ sở để so sánh với P5. P3 Việt Nam (Đỗ &amp; Phan, 2026, JABS đang phản biện) phân tích 2.958 doanh nghiệp WBES ba sóng (2009, 2015, 2023) xác nhận chữ U ngược trong cả ba sóng với điểm uốn 46,2% (2009), 39,3% (2015), 41,6% (2023), 39,7% (tổng hợp); TCI nhân quả qua biến công cụ (β = 1,639, F bậc một = 22,1); DAI theo giai đoạn và phụ thuộc chọn lựa (IV null, β = 0,018). P4 Singapore (Mar, Đỗ &amp; Phan, 2026, MIR đang phản biện) phân tích 623 doanh nghiệp WBES 2023, cho thấy điểm uốn hàm ý ở FSTS khoảng 88,6% và DAI hoạt động như nguồn lực mở rộng tình huống với hệ số DAI×FSTS² = +3,119 (p = 0,005). P5 Trung Quốc (Đỗ &amp; Phan, 2026, IJOEM đang phản biện) phân tích 4.559 doanh nghiệp WBES hai sóng (2012, 2024) xác nhận chữ U ngược bền vững cấu trúc với điểm uốn 49,4% (2012) và 47,2% (2024); kết quả này nhất quán với bằng chứng trước đó về quan hệ I–P và hiệu ứng vùng miền ở doanh nghiệp Trung Quốc (Chen &amp; Tan, 2012; Xiao et al., 2013).</w:t>
       </w:r>
     </w:p>
     <w:bookmarkEnd w:id="27"/>
@@ -3371,7 +3371,7 @@
         <w:pStyle w:val="FirstParagraph"/>
       </w:pPr>
       <w:r>
-        <w:t xml:space="preserve">P3 Việt Nam (Đỗ &amp; Phan, 2026, JABS đang phản biện): Phân tích 2.958 doanh nghiệp WBES ba sóng (2009, 2015, 2023) xác nhận chữ U ngược trong cả ba sóng với kiểm định Lind–Mehlum p &lt; 0,001 (tổng hợp). Điểm uốn: 46,2% (2009), 39,3% (2015), 41,6% (2023), 39,7% (tổng hợp). P3 phân tách H1 thành hai mệnh đề: bước nhảy từ không xuất khẩu sang xuất khẩu là biên năng suất chính; trong mẫu chỉ gồm doanh nghiệp xuất khẩu, đường cong gần phẳng. TCI (b8+e6) dương bền vững (β = 0,179 tổng hợp, p &lt; 0,001); biến công cụ cho TCI nhân quả (β = 1,639, F bậc một = 22,1). DAI phụ thuộc giai đoạn, dương năm 2009 (β = 0,175), null năm 2015, có tương tác âm năm 2023 (FSTS_c×DAI_z = −0,912, p = 0,043); biến công cụ cho DAI null (β = 0,018, p = 0,942, F bậc một = 34,6), phụ thuộc chọn lựa, không nhân quả.</w:t>
+        <w:t xml:space="preserve">P3 Việt Nam (Đỗ &amp; Phan, 2026, JABS đang phản biện): Phân tích 2.958 doanh nghiệp WBES ba sóng (2009, 2015, 2023) xác nhận chữ U ngược trong cả ba sóng với kiểm định Lind–Mehlum p &lt; 0,001 (tổng hợp). Điểm uốn: 46,2% (2009), 39,3% (2015), 41,6% (2023), 39,7% (tổng hợp). P3 phân tách H1 thành hai mệnh đề: bước nhảy từ không xuất khẩu sang xuất khẩu là biên năng suất chính (nhất quán với mô hình chọn lọc năng suất xuất khẩu của Melitz, 2003); trong mẫu chỉ gồm doanh nghiệp xuất khẩu, đường cong gần phẳng. TCI (b8+e6) dương bền vững (β = 0,179 tổng hợp, p &lt; 0,001); biến công cụ cho TCI nhân quả (β = 1,639, F bậc một = 22,1). DAI phụ thuộc giai đoạn, dương năm 2009 (β = 0,175), null năm 2015, có tương tác âm năm 2023 (FSTS_c×DAI_z = −0,912, p = 0,043); biến công cụ cho DAI null (β = 0,018, p = 0,942, F bậc một = 34,6), phụ thuộc chọn lựa, không nhân quả.</w:t>
       </w:r>
     </w:p>
     <w:p>
@@ -4021,7 +4021,7 @@
         <w:pStyle w:val="FirstParagraph"/>
       </w:pPr>
       <w:r>
-        <w:t xml:space="preserve">Resource-Based View (Wernerfelt, 1984; Barney, 1991) cho rằng lợi thế cạnh tranh bền vững xuất phát từ nguồn lực có giá trị, hiếm, khó bắt chước, và không thay thế (VRIN). Doanh nghiệp khác nhau về hiệu quả vì sở hữu các bộ nguồn lực khác nhau.</w:t>
+        <w:t xml:space="preserve">Resource-Based View (Wernerfelt, 1984; Barney, 1991) cho rằng lợi thế cạnh tranh bền vững xuất phát từ nguồn lực có giá trị, hiếm, khó bắt chước, và không thay thế (VRIN). Doanh nghiệp khác nhau về hiệu quả vì sở hữu các bộ nguồn lực khác nhau. Các phát triển gần đây mở rộng RBV sang lợi thế cạnh tranh bền vững gắn với bối cảnh môi trường, xã hội và quản trị (Bhandari, Ranta &amp; Salo, 2023).</w:t>
       </w:r>
     </w:p>
     <w:p>
@@ -4758,7 +4758,7 @@
         <w:pStyle w:val="BodyText"/>
       </w:pPr>
       <w:r>
-        <w:t xml:space="preserve">Lập luận tích hợp: quốc tế hóa là quyết định chiến lược theo logic Uppsala (tầng 1); kết quả phụ thuộc nguồn lực doanh nghiệp, TCI (RBV/Lall, 1992) đóng vai trò nâng mặt bằng nhân quả; được hỗ trợ bởi hạ tầng số có điều kiện, DAI (Foundational Digital Adoption Framework/Verhoef et al., 2021) là nguồn lực mở rộng tình huống theo CDCM; phản ánh đặc điểm nhà quản trị (Upper Echelons/Hambrick &amp; Mason, 1984); bị khuôn khổ bởi thể chế nội địa (Institutional Theory/North, 1990), gradient ICRV 6 nhóm với gánh nặng bắt buộc ở quốc đảo nhỏ; và thay đổi theo bối cảnh thời gian, thiết kế ba giai đoạn.</w:t>
+        <w:t xml:space="preserve">Lập luận tích hợp: quốc tế hóa là quyết định chiến lược theo logic Uppsala (tầng 1); kết quả phụ thuộc nguồn lực doanh nghiệp, TCI (RBV/Lall, 1992) đóng vai trò nâng mặt bằng nhân quả; được hỗ trợ bởi hạ tầng số có điều kiện, DAI (Foundational Digital Adoption Framework/Verhoef et al., 2021) là nguồn lực mở rộng tình huống theo CDCM; phản ánh đặc điểm nhà quản trị, gồm định hướng quốc tế của đội ngũ quản trị cấp cao (Upper Echelons/Hambrick &amp; Mason, 1984; Nielsen &amp; Nielsen, 2011); bị khuôn khổ bởi thể chế nội địa (Institutional Theory/North, 1990), gradient ICRV 6 nhóm với gánh nặng bắt buộc ở quốc đảo nhỏ; và thay đổi theo bối cảnh thời gian, thiết kế ba giai đoạn.</w:t>
       </w:r>
     </w:p>
     <w:p>

</xml_diff>